<commit_message>
Insert live GitHub URL into manuscript, citation and metadata
Code metadata, Software availability and Data availability now point to
https://github.com/vaspapa79/LakeForcing-OpenDrift; CITATION.cff and .zenodo.json
updated; cover letter references the repository. Zenodo DOI to be inserted on release.

Co-Authored-By: Claude Opus 4.8 <noreply@anthropic.com>
</commit_message>
<xml_diff>
--- a/paper/EMS_manuscript.docx
+++ b/paper/EMS_manuscript.docx
@@ -337,7 +337,7 @@
               <w:jc w:val="left"/>
             </w:pPr>
             <w:r>
-              <w:t>GitHub repository (URL provided at acceptance); archived on Zenodo with a citable DOI (minted at acceptance)</w:t>
+              <w:t>https://github.com/vaspapa79/LakeForcing-OpenDrift (archived on Zenodo with a citable DOI on release)</w:t>
             </w:r>
           </w:p>
         </w:tc>
@@ -7027,7 +7027,7 @@
               <w:jc w:val="left"/>
             </w:pPr>
             <w:r>
-              <w:t>GitHub (URL provided at acceptance)</w:t>
+              <w:t>https://github.com/vaspapa79/LakeForcing-OpenDrift</w:t>
             </w:r>
           </w:p>
         </w:tc>
@@ -7247,7 +7247,7 @@
         <w:jc w:val="both"/>
       </w:pPr>
       <w:r>
-        <w:t>The source code and the generated twelve-lake forcing dataset will be made openly available on GitHub and archived on Zenodo with a citable DOI upon acceptance. All input datasets (HydroLAKES, GLOBathy, DAHITI, ERA5) are openly available from their providers.</w:t>
+        <w:t>The source code is openly available at https://github.com/vaspapa79/LakeForcing-OpenDrift under the MIT licence. The generated twelve-lake forcing dataset is archived on Zenodo under CC-BY-4.0, with a citable DOI minted on release (DOI to be inserted at acceptance). All input datasets (HydroLAKES, GLOBathy, DAHITI, ERA5) are openly available from their respective providers.</w:t>
       </w:r>
     </w:p>
     <w:p>

</xml_diff>

<commit_message>
Release v1.0.1: Zenodo code archive
Bump version to 1.0.1 and clarify that the Zenodo record archives the source
code (MIT); the generated forcing dataset and reproducibility data are GitHub
release assets. Triggers the Zenodo GitHub integration for a citable code DOI.

Co-Authored-By: Claude Opus 4.8 <noreply@anthropic.com>
</commit_message>
<xml_diff>
--- a/paper/EMS_manuscript.docx
+++ b/paper/EMS_manuscript.docx
@@ -302,7 +302,7 @@
               <w:jc w:val="left"/>
             </w:pPr>
             <w:r>
-              <w:t>v1.0.0</w:t>
+              <w:t>v1.0.1</w:t>
             </w:r>
           </w:p>
         </w:tc>
@@ -6607,7 +6607,7 @@
               <w:jc w:val="left"/>
             </w:pPr>
             <w:r>
-              <w:t>v1.0.0</w:t>
+              <w:t>v1.0.1</w:t>
             </w:r>
           </w:p>
         </w:tc>
@@ -7247,7 +7247,7 @@
         <w:jc w:val="both"/>
       </w:pPr>
       <w:r>
-        <w:t>The source code is openly available at https://github.com/vaspapa79/LakeForcing-OpenDrift under the MIT licence. The generated twelve-lake forcing dataset is archived on Zenodo under CC-BY-4.0, with a citable DOI minted on release (DOI to be inserted at acceptance). All input datasets (HydroLAKES, GLOBathy, DAHITI, ERA5) are openly available from their respective providers.</w:t>
+        <w:t>The source code is openly available at https://github.com/vaspapa79/LakeForcing-OpenDrift under the MIT licence and is archived on Zenodo with a citable DOI (DOI to be inserted at acceptance). The generated twelve-lake forcing dataset (CC-BY-4.0) and the full reproducibility data are distributed as release assets of the same repository. All input datasets (HydroLAKES, GLOBathy, DAHITI, ERA5) are openly available from their respective providers.</w:t>
       </w:r>
     </w:p>
     <w:p>

</xml_diff>

<commit_message>
Insert Zenodo DOI 10.5281/zenodo.20627161
Add the minted Zenodo code-archive DOI to the manuscript (Code metadata,
Software availability, Data availability), CITATION.cff and README.

Co-Authored-By: Claude Opus 4.8 <noreply@anthropic.com>
</commit_message>
<xml_diff>
--- a/paper/EMS_manuscript.docx
+++ b/paper/EMS_manuscript.docx
@@ -337,7 +337,7 @@
               <w:jc w:val="left"/>
             </w:pPr>
             <w:r>
-              <w:t>https://github.com/vaspapa79/LakeForcing-OpenDrift (archived on Zenodo with a citable DOI on release)</w:t>
+              <w:t>https://github.com/vaspapa79/LakeForcing-OpenDrift (archived on Zenodo: https://doi.org/10.5281/zenodo.20627161)</w:t>
             </w:r>
           </w:p>
         </w:tc>
@@ -7062,7 +7062,7 @@
               <w:jc w:val="left"/>
             </w:pPr>
             <w:r>
-              <w:t>Zenodo, citable DOI minted at acceptance</w:t>
+              <w:t>Zenodo: https://doi.org/10.5281/zenodo.20627161</w:t>
             </w:r>
           </w:p>
         </w:tc>
@@ -7247,7 +7247,7 @@
         <w:jc w:val="both"/>
       </w:pPr>
       <w:r>
-        <w:t>The source code is openly available at https://github.com/vaspapa79/LakeForcing-OpenDrift under the MIT licence and is archived on Zenodo with a citable DOI (DOI to be inserted at acceptance). The generated twelve-lake forcing dataset (CC-BY-4.0) and the full reproducibility data are distributed as release assets of the same repository. All input datasets (HydroLAKES, GLOBathy, DAHITI, ERA5) are openly available from their respective providers.</w:t>
+        <w:t>The source code is openly available at https://github.com/vaspapa79/LakeForcing-OpenDrift under the MIT licence and is archived on Zenodo at https://doi.org/10.5281/zenodo.20627161. The generated twelve-lake forcing dataset (CC-BY-4.0) and the full reproducibility data are distributed as release assets of the same repository. All input datasets (HydroLAKES, GLOBathy, DAHITI, ERA5) are openly available from their respective providers.</w:t>
       </w:r>
     </w:p>
     <w:p>

</xml_diff>